<commit_message>
Regenerate the résumé from a script, with the portfolio link fixed.
The PDF's "Portfolio" link pointed at the retired Render site. There was
no source document anywhere, so scripts/build_resume.py now holds the
content and renders both the .docx and, through headless Edge, the PDF
the site links. Skills gain Rust, Go, gRPC, Redis and Kubernetes; the
summary leads with the agent-runtime work; the freelance line matches
the site.

Co-authored-by: linn-dev-gmi <linn@globalmagicko.com>
</commit_message>
<xml_diff>
--- a/content/about/resume.docx
+++ b/content/about/resume.docx
@@ -9,8 +9,8 @@
         <w:tblLook w:firstColumn="1" w:firstRow="1" w:lastColumn="0" w:lastRow="0" w:noHBand="0" w:noVBand="1" w:val="04A0"/>
       </w:tblPr>
       <w:tblGrid>
-        <w:gridCol w:w="8164"/>
-        <w:gridCol w:w="1701"/>
+        <w:gridCol w:w="4933"/>
+        <w:gridCol w:w="4933"/>
       </w:tblGrid>
       <w:tr>
         <w:tc>
@@ -388,7 +388,7 @@
         <w:rPr>
           <w:rFonts w:ascii="Times New Roman" w:hAnsi="Times New Roman" w:eastAsia="Times New Roman"/>
           <w:b w:val="0"/>
-          <w:i w:val="0"/>
+          <w:i/>
         </w:rPr>
         <w:t xml:space="preserve"> (</w:t>
       </w:r>
@@ -407,7 +407,7 @@
         <w:rPr>
           <w:rFonts w:ascii="Times New Roman" w:hAnsi="Times New Roman" w:eastAsia="Times New Roman"/>
           <w:b w:val="0"/>
-          <w:i w:val="0"/>
+          <w:i/>
         </w:rPr>
         <w:t>)</w:t>
       </w:r>
@@ -511,7 +511,7 @@
         <w:rPr>
           <w:rFonts w:ascii="Times New Roman" w:hAnsi="Times New Roman" w:eastAsia="Times New Roman"/>
           <w:b w:val="0"/>
-          <w:i w:val="0"/>
+          <w:i/>
         </w:rPr>
         <w:t xml:space="preserve"> (</w:t>
       </w:r>
@@ -530,7 +530,7 @@
         <w:rPr>
           <w:rFonts w:ascii="Times New Roman" w:hAnsi="Times New Roman" w:eastAsia="Times New Roman"/>
           <w:b w:val="0"/>
-          <w:i w:val="0"/>
+          <w:i/>
         </w:rPr>
         <w:t>)</w:t>
       </w:r>
@@ -1267,7 +1267,7 @@
     <w:rsid w:val="00FC693F"/>
     <w:rPr>
       <w:rFonts w:ascii="Times New Roman" w:hAnsi="Times New Roman" w:eastAsia="Times New Roman"/>
-      <w:sz w:val="21"/>
+      <w:sz w:val="20"/>
     </w:rPr>
   </w:style>
   <w:style w:type="paragraph" w:styleId="Header">

</xml_diff>

<commit_message>
Skills sit below experience on the résumé.
Co-authored-by: linn-dev-gmi <linn@globalmagicko.com>
</commit_message>
<xml_diff>
--- a/content/about/resume.docx
+++ b/content/about/resume.docx
@@ -216,126 +216,6 @@
           <w:i w:val="0"/>
         </w:rPr>
         <w:t>English (IELTS 8.0), Burmese (Native), Thai (Basic), Japanese (JLPT N4)</w:t>
-      </w:r>
-    </w:p>
-    <w:p>
-      <w:pPr>
-        <w:spacing w:before="160" w:after="40"/>
-      </w:pPr>
-      <w:r>
-        <w:rPr>
-          <w:rFonts w:ascii="Times New Roman" w:hAnsi="Times New Roman" w:eastAsia="Times New Roman"/>
-          <w:b/>
-          <w:i w:val="0"/>
-          <w:color w:val="2E74B5"/>
-          <w:sz w:val="24"/>
-        </w:rPr>
-        <w:t>SKILLS</w:t>
-      </w:r>
-    </w:p>
-    <w:p>
-      <w:pPr>
-        <w:spacing w:before="0" w:after="20"/>
-      </w:pPr>
-      <w:r>
-        <w:rPr>
-          <w:rFonts w:ascii="Times New Roman" w:hAnsi="Times New Roman" w:eastAsia="Times New Roman"/>
-          <w:b/>
-          <w:i w:val="0"/>
-        </w:rPr>
-        <w:t xml:space="preserve">Programming: </w:t>
-      </w:r>
-      <w:r>
-        <w:rPr>
-          <w:rFonts w:ascii="Times New Roman" w:hAnsi="Times New Roman" w:eastAsia="Times New Roman"/>
-          <w:b w:val="0"/>
-          <w:i w:val="0"/>
-        </w:rPr>
-        <w:t>Python, Rust, Go, TypeScript/JavaScript, Java, C#, HTML/CSS</w:t>
-      </w:r>
-    </w:p>
-    <w:p>
-      <w:pPr>
-        <w:spacing w:before="0" w:after="20"/>
-      </w:pPr>
-      <w:r>
-        <w:rPr>
-          <w:rFonts w:ascii="Times New Roman" w:hAnsi="Times New Roman" w:eastAsia="Times New Roman"/>
-          <w:b/>
-          <w:i w:val="0"/>
-        </w:rPr>
-        <w:t xml:space="preserve">Frameworks: </w:t>
-      </w:r>
-      <w:r>
-        <w:rPr>
-          <w:rFonts w:ascii="Times New Roman" w:hAnsi="Times New Roman" w:eastAsia="Times New Roman"/>
-          <w:b w:val="0"/>
-          <w:i w:val="0"/>
-        </w:rPr>
-        <w:t>FastAPI, Django, Node.js, Express, React, Next.js</w:t>
-      </w:r>
-    </w:p>
-    <w:p>
-      <w:pPr>
-        <w:spacing w:before="0" w:after="20"/>
-      </w:pPr>
-      <w:r>
-        <w:rPr>
-          <w:rFonts w:ascii="Times New Roman" w:hAnsi="Times New Roman" w:eastAsia="Times New Roman"/>
-          <w:b/>
-          <w:i w:val="0"/>
-        </w:rPr>
-        <w:t xml:space="preserve">AI/ML: </w:t>
-      </w:r>
-      <w:r>
-        <w:rPr>
-          <w:rFonts w:ascii="Times New Roman" w:hAnsi="Times New Roman" w:eastAsia="Times New Roman"/>
-          <w:b w:val="0"/>
-          <w:i w:val="0"/>
-        </w:rPr>
-        <w:t>LLM APIs, agent runtimes &amp; native tool calling, RAG, MCP, LangChain, OCR, Computer Vision (OpenCV, MediaPipe)</w:t>
-      </w:r>
-    </w:p>
-    <w:p>
-      <w:pPr>
-        <w:spacing w:before="0" w:after="20"/>
-      </w:pPr>
-      <w:r>
-        <w:rPr>
-          <w:rFonts w:ascii="Times New Roman" w:hAnsi="Times New Roman" w:eastAsia="Times New Roman"/>
-          <w:b/>
-          <w:i w:val="0"/>
-        </w:rPr>
-        <w:t xml:space="preserve">Backend &amp; APIs: </w:t>
-      </w:r>
-      <w:r>
-        <w:rPr>
-          <w:rFonts w:ascii="Times New Roman" w:hAnsi="Times New Roman" w:eastAsia="Times New Roman"/>
-          <w:b w:val="0"/>
-          <w:i w:val="0"/>
-        </w:rPr>
-        <w:t>gRPC/Protobuf, RESTful design, async programming, PostgreSQL, MySQL, MongoDB, Redis</w:t>
-      </w:r>
-    </w:p>
-    <w:p>
-      <w:pPr>
-        <w:spacing w:before="0" w:after="20"/>
-      </w:pPr>
-      <w:r>
-        <w:rPr>
-          <w:rFonts w:ascii="Times New Roman" w:hAnsi="Times New Roman" w:eastAsia="Times New Roman"/>
-          <w:b/>
-          <w:i w:val="0"/>
-        </w:rPr>
-        <w:t xml:space="preserve">DevOps &amp; Tools: </w:t>
-      </w:r>
-      <w:r>
-        <w:rPr>
-          <w:rFonts w:ascii="Times New Roman" w:hAnsi="Times New Roman" w:eastAsia="Times New Roman"/>
-          <w:b w:val="0"/>
-          <w:i w:val="0"/>
-        </w:rPr>
-        <w:t>Docker, Kubernetes, CI/CD (GitHub Actions), Git, Grafana, OpenTelemetry, pytest, Jira, AWS</w:t>
       </w:r>
     </w:p>
     <w:p>
@@ -774,6 +654,126 @@
           <w:color w:val="2E74B5"/>
           <w:sz w:val="24"/>
         </w:rPr>
+        <w:t>SKILLS</w:t>
+      </w:r>
+    </w:p>
+    <w:p>
+      <w:pPr>
+        <w:spacing w:before="0" w:after="20"/>
+      </w:pPr>
+      <w:r>
+        <w:rPr>
+          <w:rFonts w:ascii="Times New Roman" w:hAnsi="Times New Roman" w:eastAsia="Times New Roman"/>
+          <w:b/>
+          <w:i w:val="0"/>
+        </w:rPr>
+        <w:t xml:space="preserve">Programming: </w:t>
+      </w:r>
+      <w:r>
+        <w:rPr>
+          <w:rFonts w:ascii="Times New Roman" w:hAnsi="Times New Roman" w:eastAsia="Times New Roman"/>
+          <w:b w:val="0"/>
+          <w:i w:val="0"/>
+        </w:rPr>
+        <w:t>Python, Rust, Go, TypeScript/JavaScript, Java, C#, HTML/CSS</w:t>
+      </w:r>
+    </w:p>
+    <w:p>
+      <w:pPr>
+        <w:spacing w:before="0" w:after="20"/>
+      </w:pPr>
+      <w:r>
+        <w:rPr>
+          <w:rFonts w:ascii="Times New Roman" w:hAnsi="Times New Roman" w:eastAsia="Times New Roman"/>
+          <w:b/>
+          <w:i w:val="0"/>
+        </w:rPr>
+        <w:t xml:space="preserve">Frameworks: </w:t>
+      </w:r>
+      <w:r>
+        <w:rPr>
+          <w:rFonts w:ascii="Times New Roman" w:hAnsi="Times New Roman" w:eastAsia="Times New Roman"/>
+          <w:b w:val="0"/>
+          <w:i w:val="0"/>
+        </w:rPr>
+        <w:t>FastAPI, Django, Node.js, Express, React, Next.js</w:t>
+      </w:r>
+    </w:p>
+    <w:p>
+      <w:pPr>
+        <w:spacing w:before="0" w:after="20"/>
+      </w:pPr>
+      <w:r>
+        <w:rPr>
+          <w:rFonts w:ascii="Times New Roman" w:hAnsi="Times New Roman" w:eastAsia="Times New Roman"/>
+          <w:b/>
+          <w:i w:val="0"/>
+        </w:rPr>
+        <w:t xml:space="preserve">AI/ML: </w:t>
+      </w:r>
+      <w:r>
+        <w:rPr>
+          <w:rFonts w:ascii="Times New Roman" w:hAnsi="Times New Roman" w:eastAsia="Times New Roman"/>
+          <w:b w:val="0"/>
+          <w:i w:val="0"/>
+        </w:rPr>
+        <w:t>LLM APIs, agent runtimes &amp; native tool calling, RAG, MCP, LangChain, OCR, Computer Vision (OpenCV, MediaPipe)</w:t>
+      </w:r>
+    </w:p>
+    <w:p>
+      <w:pPr>
+        <w:spacing w:before="0" w:after="20"/>
+      </w:pPr>
+      <w:r>
+        <w:rPr>
+          <w:rFonts w:ascii="Times New Roman" w:hAnsi="Times New Roman" w:eastAsia="Times New Roman"/>
+          <w:b/>
+          <w:i w:val="0"/>
+        </w:rPr>
+        <w:t xml:space="preserve">Backend &amp; APIs: </w:t>
+      </w:r>
+      <w:r>
+        <w:rPr>
+          <w:rFonts w:ascii="Times New Roman" w:hAnsi="Times New Roman" w:eastAsia="Times New Roman"/>
+          <w:b w:val="0"/>
+          <w:i w:val="0"/>
+        </w:rPr>
+        <w:t>gRPC/Protobuf, RESTful design, async programming, PostgreSQL, MySQL, MongoDB, Redis</w:t>
+      </w:r>
+    </w:p>
+    <w:p>
+      <w:pPr>
+        <w:spacing w:before="0" w:after="20"/>
+      </w:pPr>
+      <w:r>
+        <w:rPr>
+          <w:rFonts w:ascii="Times New Roman" w:hAnsi="Times New Roman" w:eastAsia="Times New Roman"/>
+          <w:b/>
+          <w:i w:val="0"/>
+        </w:rPr>
+        <w:t xml:space="preserve">DevOps &amp; Tools: </w:t>
+      </w:r>
+      <w:r>
+        <w:rPr>
+          <w:rFonts w:ascii="Times New Roman" w:hAnsi="Times New Roman" w:eastAsia="Times New Roman"/>
+          <w:b w:val="0"/>
+          <w:i w:val="0"/>
+        </w:rPr>
+        <w:t>Docker, Kubernetes, CI/CD (GitHub Actions), Git, Grafana, OpenTelemetry, pytest, Jira, AWS</w:t>
+      </w:r>
+    </w:p>
+    <w:p>
+      <w:pPr>
+        <w:spacing w:before="160" w:after="40"/>
+      </w:pPr>
+      <w:r>
+        <w:rPr>
+          <w:rFonts w:ascii="Times New Roman" w:hAnsi="Times New Roman" w:eastAsia="Times New Roman"/>
+          <w:b/>
+          <w:i w:val="0"/>
+          <w:color w:val="2E74B5"/>
+          <w:sz w:val="24"/>
+        </w:rPr>
         <w:t>PROJECTS &amp; ACHIEVEMENTS</w:t>
       </w:r>
     </w:p>

</xml_diff>

<commit_message>
Drop the photo from the résumé.
Co-authored-by: linn-dev-gmi <linn@globalmagicko.com>
</commit_message>
<xml_diff>
--- a/content/about/resume.docx
+++ b/content/about/resume.docx
@@ -2,173 +2,111 @@
 <file path=word/document.xml><?xml version="1.0" encoding="utf-8"?>
 <w:document xmlns:wpc="http://schemas.microsoft.com/office/word/2010/wordprocessingCanvas" xmlns:mo="http://schemas.microsoft.com/office/mac/office/2008/main" xmlns:mc="http://schemas.openxmlformats.org/markup-compatibility/2006" xmlns:mv="urn:schemas-microsoft-com:mac:vml" xmlns:o="urn:schemas-microsoft-com:office:office" xmlns:r="http://schemas.openxmlformats.org/officeDocument/2006/relationships" xmlns:m="http://schemas.openxmlformats.org/officeDocument/2006/math" xmlns:v="urn:schemas-microsoft-com:vml" xmlns:wp14="http://schemas.microsoft.com/office/word/2010/wordprocessingDrawing" xmlns:wp="http://schemas.openxmlformats.org/drawingml/2006/wordprocessingDrawing" xmlns:w10="urn:schemas-microsoft-com:office:word" xmlns:w="http://schemas.openxmlformats.org/wordprocessingml/2006/main" xmlns:w14="http://schemas.microsoft.com/office/word/2010/wordml" xmlns:wpg="http://schemas.microsoft.com/office/word/2010/wordprocessingGroup" xmlns:wpi="http://schemas.microsoft.com/office/word/2010/wordprocessingInk" xmlns:wne="http://schemas.microsoft.com/office/word/2006/wordml" xmlns:wps="http://schemas.microsoft.com/office/word/2010/wordprocessingShape" mc:Ignorable="w14 wp14">
   <w:body>
-    <w:tbl>
-      <w:tblPr>
-        <w:tblW w:type="auto" w:w="0"/>
-        <w:tblLayout w:type="fixed"/>
-        <w:tblLook w:firstColumn="1" w:firstRow="1" w:lastColumn="0" w:lastRow="0" w:noHBand="0" w:noVBand="1" w:val="04A0"/>
-      </w:tblPr>
-      <w:tblGrid>
-        <w:gridCol w:w="4933"/>
-        <w:gridCol w:w="4933"/>
-      </w:tblGrid>
-      <w:tr>
-        <w:tc>
-          <w:tcPr>
-            <w:tcW w:type="dxa" w:w="8164"/>
-          </w:tcPr>
-          <w:p>
-            <w:pPr>
-              <w:spacing w:after="0"/>
-            </w:pPr>
-            <w:r>
-              <w:rPr>
-                <w:rFonts w:ascii="Times New Roman" w:hAnsi="Times New Roman" w:eastAsia="Times New Roman"/>
-                <w:b/>
-                <w:i w:val="0"/>
-                <w:sz w:val="48"/>
-              </w:rPr>
-              <w:t>HTIN LINN</w:t>
-            </w:r>
-          </w:p>
-          <w:p>
-            <w:pPr>
-              <w:spacing w:after="40"/>
-            </w:pPr>
-            <w:r>
-              <w:rPr>
-                <w:rFonts w:ascii="Times New Roman" w:hAnsi="Times New Roman" w:eastAsia="Times New Roman"/>
-                <w:b w:val="0"/>
-                <w:i w:val="0"/>
-                <w:sz w:val="30"/>
-              </w:rPr>
-              <w:t>Software Engineer</w:t>
-            </w:r>
-          </w:p>
-          <w:p>
-            <w:pPr>
-              <w:spacing w:after="0"/>
-            </w:pPr>
-            <w:r>
-              <w:rPr>
-                <w:rFonts w:ascii="Times New Roman" w:hAnsi="Times New Roman" w:eastAsia="Times New Roman"/>
-                <w:b w:val="0"/>
-                <w:i w:val="0"/>
-              </w:rPr>
-              <w:t xml:space="preserve">Burmese | Bangkok, Thailand | +66 65 556 6035 | </w:t>
-            </w:r>
-            <w:hyperlink r:id="rId9">
-              <w:r>
-                <w:rPr>
-                  <w:rFonts w:ascii="Times New Roman" w:hAnsi="Times New Roman" w:eastAsia="Times New Roman" w:cs="Times New Roman"/>
-                  <w:color w:val="0563C1"/>
-                  <w:u w:val="single"/>
-                </w:rPr>
-                <w:t xml:space="preserve">htinlinn.dev.03@gmail.com</w:t>
-              </w:r>
-            </w:hyperlink>
-            <w:r>
-              <w:rPr>
-                <w:rFonts w:ascii="Times New Roman" w:hAnsi="Times New Roman" w:eastAsia="Times New Roman"/>
-                <w:b w:val="0"/>
-                <w:i w:val="0"/>
-              </w:rPr>
-              <w:t xml:space="preserve"> | </w:t>
-            </w:r>
-            <w:hyperlink r:id="rId10">
-              <w:r>
-                <w:rPr>
-                  <w:rFonts w:ascii="Times New Roman" w:hAnsi="Times New Roman" w:eastAsia="Times New Roman" w:cs="Times New Roman"/>
-                  <w:color w:val="0563C1"/>
-                  <w:u w:val="single"/>
-                </w:rPr>
-                <w:t xml:space="preserve">LinkedIn</w:t>
-              </w:r>
-            </w:hyperlink>
-            <w:r>
-              <w:rPr>
-                <w:rFonts w:ascii="Times New Roman" w:hAnsi="Times New Roman" w:eastAsia="Times New Roman"/>
-                <w:b w:val="0"/>
-                <w:i w:val="0"/>
-              </w:rPr>
-              <w:t xml:space="preserve"> | </w:t>
-            </w:r>
-            <w:hyperlink r:id="rId11">
-              <w:r>
-                <w:rPr>
-                  <w:rFonts w:ascii="Times New Roman" w:hAnsi="Times New Roman" w:eastAsia="Times New Roman" w:cs="Times New Roman"/>
-                  <w:color w:val="0563C1"/>
-                  <w:u w:val="single"/>
-                </w:rPr>
-                <w:t xml:space="preserve">GitHub</w:t>
-              </w:r>
-            </w:hyperlink>
-            <w:r>
-              <w:rPr>
-                <w:rFonts w:ascii="Times New Roman" w:hAnsi="Times New Roman" w:eastAsia="Times New Roman"/>
-                <w:b w:val="0"/>
-                <w:i w:val="0"/>
-              </w:rPr>
-              <w:t xml:space="preserve"> | </w:t>
-            </w:r>
-            <w:hyperlink r:id="rId12">
-              <w:r>
-                <w:rPr>
-                  <w:rFonts w:ascii="Times New Roman" w:hAnsi="Times New Roman" w:eastAsia="Times New Roman" w:cs="Times New Roman"/>
-                  <w:color w:val="0563C1"/>
-                  <w:u w:val="single"/>
-                </w:rPr>
-                <w:t xml:space="preserve">Portfolio</w:t>
-              </w:r>
-            </w:hyperlink>
-          </w:p>
-        </w:tc>
-        <w:tc>
-          <w:tcPr>
-            <w:tcW w:type="dxa" w:w="1701"/>
-          </w:tcPr>
-          <w:p>
-            <w:pPr>
-              <w:jc w:val="right"/>
-            </w:pPr>
-            <w:r>
-              <w:drawing>
-                <wp:inline xmlns:a="http://schemas.openxmlformats.org/drawingml/2006/main" xmlns:pic="http://schemas.openxmlformats.org/drawingml/2006/picture">
-                  <wp:extent cx="936000" cy="936000"/>
-                  <wp:docPr id="1" name="Picture 1"/>
-                  <wp:cNvGraphicFramePr>
-                    <a:graphicFrameLocks noChangeAspect="1"/>
-                  </wp:cNvGraphicFramePr>
-                  <a:graphic>
-                    <a:graphicData uri="http://schemas.openxmlformats.org/drawingml/2006/picture">
-                      <pic:pic>
-                        <pic:nvPicPr>
-                          <pic:cNvPr id="0" name="profile.png"/>
-                          <pic:cNvPicPr/>
-                        </pic:nvPicPr>
-                        <pic:blipFill>
-                          <a:blip r:embed="rId13"/>
-                          <a:stretch>
-                            <a:fillRect/>
-                          </a:stretch>
-                        </pic:blipFill>
-                        <pic:spPr>
-                          <a:xfrm>
-                            <a:off x="0" y="0"/>
-                            <a:ext cx="936000" cy="936000"/>
-                          </a:xfrm>
-                          <a:prstGeom prst="rect"/>
-                        </pic:spPr>
-                      </pic:pic>
-                    </a:graphicData>
-                  </a:graphic>
-                </wp:inline>
-              </w:drawing>
-            </w:r>
-          </w:p>
-        </w:tc>
-      </w:tr>
-    </w:tbl>
+    <w:p>
+      <w:pPr>
+        <w:spacing w:before="0" w:after="0"/>
+      </w:pPr>
+      <w:r>
+        <w:rPr>
+          <w:rFonts w:ascii="Times New Roman" w:hAnsi="Times New Roman" w:eastAsia="Times New Roman"/>
+          <w:b/>
+          <w:i w:val="0"/>
+          <w:sz w:val="48"/>
+        </w:rPr>
+        <w:t>HTIN LINN</w:t>
+      </w:r>
+    </w:p>
+    <w:p>
+      <w:pPr>
+        <w:spacing w:before="0" w:after="40"/>
+      </w:pPr>
+      <w:r>
+        <w:rPr>
+          <w:rFonts w:ascii="Times New Roman" w:hAnsi="Times New Roman" w:eastAsia="Times New Roman"/>
+          <w:b w:val="0"/>
+          <w:i w:val="0"/>
+          <w:sz w:val="30"/>
+        </w:rPr>
+        <w:t>Software Engineer</w:t>
+      </w:r>
+    </w:p>
+    <w:p>
+      <w:pPr>
+        <w:spacing w:before="0" w:after="0"/>
+      </w:pPr>
+      <w:r>
+        <w:rPr>
+          <w:rFonts w:ascii="Times New Roman" w:hAnsi="Times New Roman" w:eastAsia="Times New Roman"/>
+          <w:b w:val="0"/>
+          <w:i w:val="0"/>
+        </w:rPr>
+        <w:t xml:space="preserve">Burmese | Bangkok, Thailand | +66 65 556 6035 | </w:t>
+      </w:r>
+      <w:hyperlink r:id="rId9">
+        <w:r>
+          <w:rPr>
+            <w:rFonts w:ascii="Times New Roman" w:hAnsi="Times New Roman" w:eastAsia="Times New Roman" w:cs="Times New Roman"/>
+            <w:color w:val="0563C1"/>
+            <w:u w:val="single"/>
+          </w:rPr>
+          <w:t xml:space="preserve">htinlinn.dev.03@gmail.com</w:t>
+        </w:r>
+      </w:hyperlink>
+      <w:r>
+        <w:rPr>
+          <w:rFonts w:ascii="Times New Roman" w:hAnsi="Times New Roman" w:eastAsia="Times New Roman"/>
+          <w:b w:val="0"/>
+          <w:i w:val="0"/>
+        </w:rPr>
+        <w:t xml:space="preserve"> | </w:t>
+      </w:r>
+      <w:hyperlink r:id="rId10">
+        <w:r>
+          <w:rPr>
+            <w:rFonts w:ascii="Times New Roman" w:hAnsi="Times New Roman" w:eastAsia="Times New Roman" w:cs="Times New Roman"/>
+            <w:color w:val="0563C1"/>
+            <w:u w:val="single"/>
+          </w:rPr>
+          <w:t xml:space="preserve">LinkedIn</w:t>
+        </w:r>
+      </w:hyperlink>
+      <w:r>
+        <w:rPr>
+          <w:rFonts w:ascii="Times New Roman" w:hAnsi="Times New Roman" w:eastAsia="Times New Roman"/>
+          <w:b w:val="0"/>
+          <w:i w:val="0"/>
+        </w:rPr>
+        <w:t xml:space="preserve"> | </w:t>
+      </w:r>
+      <w:hyperlink r:id="rId11">
+        <w:r>
+          <w:rPr>
+            <w:rFonts w:ascii="Times New Roman" w:hAnsi="Times New Roman" w:eastAsia="Times New Roman" w:cs="Times New Roman"/>
+            <w:color w:val="0563C1"/>
+            <w:u w:val="single"/>
+          </w:rPr>
+          <w:t xml:space="preserve">GitHub</w:t>
+        </w:r>
+      </w:hyperlink>
+      <w:r>
+        <w:rPr>
+          <w:rFonts w:ascii="Times New Roman" w:hAnsi="Times New Roman" w:eastAsia="Times New Roman"/>
+          <w:b w:val="0"/>
+          <w:i w:val="0"/>
+        </w:rPr>
+        <w:t xml:space="preserve"> | </w:t>
+      </w:r>
+      <w:hyperlink r:id="rId12">
+        <w:r>
+          <w:rPr>
+            <w:rFonts w:ascii="Times New Roman" w:hAnsi="Times New Roman" w:eastAsia="Times New Roman" w:cs="Times New Roman"/>
+            <w:color w:val="0563C1"/>
+            <w:u w:val="single"/>
+          </w:rPr>
+          <w:t xml:space="preserve">Portfolio</w:t>
+        </w:r>
+      </w:hyperlink>
+    </w:p>
     <w:p>
       <w:pPr>
         <w:spacing w:before="160" w:after="40"/>
@@ -253,7 +191,7 @@
         </w:rPr>
         <w:t xml:space="preserve"> | </w:t>
       </w:r>
-      <w:hyperlink r:id="rId14">
+      <w:hyperlink r:id="rId13">
         <w:r>
           <w:rPr>
             <w:rFonts w:ascii="Times New Roman" w:hAnsi="Times New Roman" w:eastAsia="Times New Roman" w:cs="Times New Roman"/>
@@ -272,7 +210,7 @@
         </w:rPr>
         <w:t xml:space="preserve"> (</w:t>
       </w:r>
-      <w:hyperlink r:id="rId15">
+      <w:hyperlink r:id="rId14">
         <w:r>
           <w:rPr>
             <w:rFonts w:ascii="Times New Roman" w:hAnsi="Times New Roman" w:eastAsia="Times New Roman" w:cs="Times New Roman"/>
@@ -376,7 +314,7 @@
         </w:rPr>
         <w:t xml:space="preserve"> | </w:t>
       </w:r>
-      <w:hyperlink r:id="rId16">
+      <w:hyperlink r:id="rId15">
         <w:r>
           <w:rPr>
             <w:rFonts w:ascii="Times New Roman" w:hAnsi="Times New Roman" w:eastAsia="Times New Roman" w:cs="Times New Roman"/>
@@ -395,7 +333,7 @@
         </w:rPr>
         <w:t xml:space="preserve"> (</w:t>
       </w:r>
-      <w:hyperlink r:id="rId17">
+      <w:hyperlink r:id="rId16">
         <w:r>
           <w:rPr>
             <w:rFonts w:ascii="Times New Roman" w:hAnsi="Times New Roman" w:eastAsia="Times New Roman" w:cs="Times New Roman"/>
@@ -513,7 +451,7 @@
         </w:rPr>
         <w:t xml:space="preserve"> | </w:t>
       </w:r>
-      <w:hyperlink r:id="rId18">
+      <w:hyperlink r:id="rId17">
         <w:r>
           <w:rPr>
             <w:rFonts w:ascii="Times New Roman" w:hAnsi="Times New Roman" w:eastAsia="Times New Roman" w:cs="Times New Roman"/>

</xml_diff>

<commit_message>
Résumé summary leads with Python.
Co-authored-by: linn-dev-gmi <linn@globalmagicko.com>
</commit_message>
<xml_diff>
--- a/content/about/resume.docx
+++ b/content/about/resume.docx
@@ -132,7 +132,7 @@
           <w:b w:val="0"/>
           <w:i w:val="0"/>
         </w:rPr>
-        <w:t>Software Engineer building the runtime AI agents run on: an agent supervisor, a reasoning service and agent memory, in Rust, Go and Python. Previously shipped production Python microservices and AI/LLM integrations, with a focus on automated testing, CI/CD and reliable API design.</w:t>
+        <w:t>Python-first Software Engineer building production backend and AI services: REST and gRPC APIs, MCP servers and LLM integrations, deployed on Kubernetes with CI/CD and automated testing. Currently building the runtime AI agents run on, across Python, Rust and Go.</w:t>
       </w:r>
     </w:p>
     <w:p>
@@ -613,7 +613,7 @@
           <w:b w:val="0"/>
           <w:i w:val="0"/>
         </w:rPr>
-        <w:t>Python, Rust, Go, TypeScript/JavaScript, Java, C#, HTML/CSS</w:t>
+        <w:t>Python, TypeScript/JavaScript, Rust, Go, Java, C#, HTML/CSS</w:t>
       </w:r>
     </w:p>
     <w:p>

</xml_diff>

<commit_message>
Résumé bullets in plain sentences.
Co-authored-by: linn-dev-gmi <linn@globalmagicko.com>
</commit_message>
<xml_diff>
--- a/content/about/resume.docx
+++ b/content/about/resume.docx
@@ -132,7 +132,7 @@
           <w:b w:val="0"/>
           <w:i w:val="0"/>
         </w:rPr>
-        <w:t>Python-first Software Engineer building production backend and AI services: REST and gRPC APIs, MCP servers and LLM integrations, deployed on Kubernetes with CI/CD and automated testing. Currently building the runtime AI agents run on, across Python, Rust and Go.</w:t>
+        <w:t>Software engineer, Python first. I build production backend and AI services: REST and gRPC APIs, MCP servers and LLM integrations, deployed on Kubernetes with CI/CD and automated tests. Currently building the runtime that AI agents run on, in Python, Rust and Go.</w:t>
       </w:r>
     </w:p>
     <w:p>
@@ -249,7 +249,7 @@
           <w:b w:val="0"/>
           <w:i w:val="0"/>
         </w:rPr>
-        <w:t>Top committer since joining on the reasoning, agent-memory and supervisor services; contributor to Mindroid, the open-source Rust agent runtime.</w:t>
+        <w:t>Top committer since joining on the reasoning, memory and supervisor services. Contributor to Mindroid, the open-source Rust agent runtime.</w:t>
       </w:r>
     </w:p>
     <w:p>
@@ -263,7 +263,7 @@
           <w:b w:val="0"/>
           <w:i w:val="0"/>
         </w:rPr>
-        <w:t>Built the agent supervisor that mints per-agent credentials and runs each agent as an isolated process joining workspaces over pub/sub as a first-class participant; engineered its execution loop with caching, cutting agent turn latency from 4s to 2.5s.</w:t>
+        <w:t>Built the agent supervisor: it mints credentials for each agent and runs it as an isolated process that joins workspaces over pub/sub. Added caching to its execution loop, cutting agent turn latency from 4s to 2.5s.</w:t>
       </w:r>
     </w:p>
     <w:p>
@@ -277,7 +277,7 @@
           <w:b w:val="0"/>
           <w:i w:val="0"/>
         </w:rPr>
-        <w:t>Refactored the reasoning service, cutting fast-path latency 40%, and implemented frontier methods (RLM, Lambda-RLM, Mixture of Judges, MCTS) that lifted GPQA accuracy by 22–34 points over a direct call with the same model.</w:t>
+        <w:t>Refactored the reasoning service, cutting fast-path latency 40%. Implemented RLM, Lambda-RLM, Mixture of Judges and MCTS; on GPQA they score 22–34 points above a direct call with the same model.</w:t>
       </w:r>
     </w:p>
     <w:p>
@@ -291,7 +291,7 @@
           <w:b w:val="0"/>
           <w:i w:val="0"/>
         </w:rPr>
-        <w:t>Shipped native tool calling and mid-turn dual-model escalation across the gateway, reasoning service and supervisor, plus an OpenAI-compatible chat-completions route with tool and image support.</w:t>
+        <w:t>Shipped native tool calling and mid-turn escalation from a fast model to a frontier model across the gateway, reasoning service and supervisor, plus an OpenAI-compatible chat-completions route with tool and image support.</w:t>
       </w:r>
     </w:p>
     <w:p>
@@ -386,7 +386,7 @@
           <w:b w:val="0"/>
           <w:i w:val="0"/>
         </w:rPr>
-        <w:t>Developed AI-powered services (FastAPI) using RAG, MCP servers, and AI-driven UI widgets.</w:t>
+        <w:t>Built FastAPI services using RAG, MCP servers and AI-driven UI widgets.</w:t>
       </w:r>
     </w:p>
     <w:p>
@@ -400,7 +400,7 @@
           <w:b w:val="0"/>
           <w:i w:val="0"/>
         </w:rPr>
-        <w:t>Created a shared CRM integration service (Zoho, Chatwoot, Zendesk) used across multiple products.</w:t>
+        <w:t>Built the shared CRM integration service (Zoho, Chatwoot, Zendesk) used by several products.</w:t>
       </w:r>
     </w:p>
     <w:p>
@@ -414,7 +414,7 @@
           <w:b w:val="0"/>
           <w:i w:val="0"/>
         </w:rPr>
-        <w:t>Cut container build/startup time by 30% via Docker optimization and added OpenTelemetry + Grafana.</w:t>
+        <w:t>Cut container build and startup time by 30% with Docker changes, and added OpenTelemetry and Grafana.</w:t>
       </w:r>
     </w:p>
     <w:p>
@@ -510,7 +510,7 @@
           <w:b w:val="0"/>
           <w:i w:val="0"/>
         </w:rPr>
-        <w:t>Developed a Python/Django course recommendation system adopted by 100+ students.</w:t>
+        <w:t>Built a Python/Django course recommendation system used by 100+ students.</w:t>
       </w:r>
     </w:p>
     <w:p>

</xml_diff>

<commit_message>
Résumé: metrics in bold.
Co-authored-by: linn-dev-gmi <linn@globalmagicko.com>
</commit_message>
<xml_diff>
--- a/content/about/resume.docx
+++ b/content/about/resume.docx
@@ -246,10 +246,18 @@
       <w:r>
         <w:rPr>
           <w:rFonts w:ascii="Times New Roman" w:hAnsi="Times New Roman" w:eastAsia="Times New Roman"/>
+          <w:b/>
+          <w:i w:val="0"/>
+        </w:rPr>
+        <w:t>Top committer</w:t>
+      </w:r>
+      <w:r>
+        <w:rPr>
+          <w:rFonts w:ascii="Times New Roman" w:hAnsi="Times New Roman" w:eastAsia="Times New Roman"/>
           <w:b w:val="0"/>
           <w:i w:val="0"/>
         </w:rPr>
-        <w:t>Top committer since joining on the reasoning, memory and supervisor services. Contributor to Mindroid, the open-source Rust agent runtime.</w:t>
+        <w:t xml:space="preserve"> since joining on the reasoning, memory and supervisor services. Contributor to Mindroid, the open-source Rust agent runtime.</w:t>
       </w:r>
     </w:p>
     <w:p>
@@ -263,7 +271,23 @@
           <w:b w:val="0"/>
           <w:i w:val="0"/>
         </w:rPr>
-        <w:t>Built the agent supervisor: it mints credentials for each agent and runs it as an isolated process that joins workspaces over pub/sub. Added caching to its execution loop, cutting agent turn latency from 4s to 2.5s.</w:t>
+        <w:t xml:space="preserve">Built the agent supervisor: it mints credentials for each agent and runs it as an isolated process that joins workspaces over pub/sub. Added caching to its execution loop, cutting agent turn latency from </w:t>
+      </w:r>
+      <w:r>
+        <w:rPr>
+          <w:rFonts w:ascii="Times New Roman" w:hAnsi="Times New Roman" w:eastAsia="Times New Roman"/>
+          <w:b/>
+          <w:i w:val="0"/>
+        </w:rPr>
+        <w:t>4s to 2.5s</w:t>
+      </w:r>
+      <w:r>
+        <w:rPr>
+          <w:rFonts w:ascii="Times New Roman" w:hAnsi="Times New Roman" w:eastAsia="Times New Roman"/>
+          <w:b w:val="0"/>
+          <w:i w:val="0"/>
+        </w:rPr>
+        <w:t>.</w:t>
       </w:r>
     </w:p>
     <w:p>
@@ -277,7 +301,39 @@
           <w:b w:val="0"/>
           <w:i w:val="0"/>
         </w:rPr>
-        <w:t>Refactored the reasoning service, cutting fast-path latency 40%. Implemented RLM, Lambda-RLM, Mixture of Judges and MCTS; on GPQA they score 22–34 points above a direct call with the same model.</w:t>
+        <w:t xml:space="preserve">Refactored the reasoning service, cutting fast-path latency </w:t>
+      </w:r>
+      <w:r>
+        <w:rPr>
+          <w:rFonts w:ascii="Times New Roman" w:hAnsi="Times New Roman" w:eastAsia="Times New Roman"/>
+          <w:b/>
+          <w:i w:val="0"/>
+        </w:rPr>
+        <w:t>40%</w:t>
+      </w:r>
+      <w:r>
+        <w:rPr>
+          <w:rFonts w:ascii="Times New Roman" w:hAnsi="Times New Roman" w:eastAsia="Times New Roman"/>
+          <w:b w:val="0"/>
+          <w:i w:val="0"/>
+        </w:rPr>
+        <w:t xml:space="preserve">. Implemented RLM, Lambda-RLM, Mixture of Judges and MCTS; on GPQA they score </w:t>
+      </w:r>
+      <w:r>
+        <w:rPr>
+          <w:rFonts w:ascii="Times New Roman" w:hAnsi="Times New Roman" w:eastAsia="Times New Roman"/>
+          <w:b/>
+          <w:i w:val="0"/>
+        </w:rPr>
+        <w:t>22–34 points</w:t>
+      </w:r>
+      <w:r>
+        <w:rPr>
+          <w:rFonts w:ascii="Times New Roman" w:hAnsi="Times New Roman" w:eastAsia="Times New Roman"/>
+          <w:b w:val="0"/>
+          <w:i w:val="0"/>
+        </w:rPr>
+        <w:t xml:space="preserve"> above a direct call with the same model.</w:t>
       </w:r>
     </w:p>
     <w:p>
@@ -414,7 +470,23 @@
           <w:b w:val="0"/>
           <w:i w:val="0"/>
         </w:rPr>
-        <w:t>Cut container build and startup time by 30% with Docker changes, and added OpenTelemetry and Grafana.</w:t>
+        <w:t xml:space="preserve">Cut container build and startup time by </w:t>
+      </w:r>
+      <w:r>
+        <w:rPr>
+          <w:rFonts w:ascii="Times New Roman" w:hAnsi="Times New Roman" w:eastAsia="Times New Roman"/>
+          <w:b/>
+          <w:i w:val="0"/>
+        </w:rPr>
+        <w:t>30%</w:t>
+      </w:r>
+      <w:r>
+        <w:rPr>
+          <w:rFonts w:ascii="Times New Roman" w:hAnsi="Times New Roman" w:eastAsia="Times New Roman"/>
+          <w:b w:val="0"/>
+          <w:i w:val="0"/>
+        </w:rPr>
+        <w:t xml:space="preserve"> with Docker changes, and added OpenTelemetry and Grafana.</w:t>
       </w:r>
     </w:p>
     <w:p>
@@ -482,7 +554,23 @@
           <w:b w:val="0"/>
           <w:i w:val="0"/>
         </w:rPr>
-        <w:t>Built a QR-based attendance system (Next.js/Express) saving 15 minutes per class per staff.</w:t>
+        <w:t xml:space="preserve">Built a QR-based attendance system (Next.js/Express) saving </w:t>
+      </w:r>
+      <w:r>
+        <w:rPr>
+          <w:rFonts w:ascii="Times New Roman" w:hAnsi="Times New Roman" w:eastAsia="Times New Roman"/>
+          <w:b/>
+          <w:i w:val="0"/>
+        </w:rPr>
+        <w:t>15 minutes</w:t>
+      </w:r>
+      <w:r>
+        <w:rPr>
+          <w:rFonts w:ascii="Times New Roman" w:hAnsi="Times New Roman" w:eastAsia="Times New Roman"/>
+          <w:b w:val="0"/>
+          <w:i w:val="0"/>
+        </w:rPr>
+        <w:t xml:space="preserve"> per class per staff.</w:t>
       </w:r>
     </w:p>
     <w:p>
@@ -496,7 +584,23 @@
           <w:b w:val="0"/>
           <w:i w:val="0"/>
         </w:rPr>
-        <w:t>Led Express backend &amp; React frontend for a job fair platform used by 300+ students and 100+ companies.</w:t>
+        <w:t xml:space="preserve">Led Express backend &amp; React frontend for a job fair platform used by </w:t>
+      </w:r>
+      <w:r>
+        <w:rPr>
+          <w:rFonts w:ascii="Times New Roman" w:hAnsi="Times New Roman" w:eastAsia="Times New Roman"/>
+          <w:b/>
+          <w:i w:val="0"/>
+        </w:rPr>
+        <w:t>300+ students and 100+ companies</w:t>
+      </w:r>
+      <w:r>
+        <w:rPr>
+          <w:rFonts w:ascii="Times New Roman" w:hAnsi="Times New Roman" w:eastAsia="Times New Roman"/>
+          <w:b w:val="0"/>
+          <w:i w:val="0"/>
+        </w:rPr>
+        <w:t>.</w:t>
       </w:r>
     </w:p>
     <w:p>
@@ -510,7 +614,23 @@
           <w:b w:val="0"/>
           <w:i w:val="0"/>
         </w:rPr>
-        <w:t>Built a Python/Django course recommendation system used by 100+ students.</w:t>
+        <w:t xml:space="preserve">Built a Python/Django course recommendation system used by </w:t>
+      </w:r>
+      <w:r>
+        <w:rPr>
+          <w:rFonts w:ascii="Times New Roman" w:hAnsi="Times New Roman" w:eastAsia="Times New Roman"/>
+          <w:b/>
+          <w:i w:val="0"/>
+        </w:rPr>
+        <w:t>100+ students</w:t>
+      </w:r>
+      <w:r>
+        <w:rPr>
+          <w:rFonts w:ascii="Times New Roman" w:hAnsi="Times New Roman" w:eastAsia="Times New Roman"/>
+          <w:b w:val="0"/>
+          <w:i w:val="0"/>
+        </w:rPr>
+        <w:t>.</w:t>
       </w:r>
     </w:p>
     <w:p>
@@ -813,7 +933,31 @@
           <w:b w:val="0"/>
           <w:i/>
         </w:rPr>
-        <w:t>Rangsit University | Pathum Thani, Thailand | 2022-2025 | GPA: 3.96/4 | First Class Honours</w:t>
+        <w:t xml:space="preserve">Rangsit University | Pathum Thani, Thailand | 2022-2025 | </w:t>
+      </w:r>
+      <w:r>
+        <w:rPr>
+          <w:rFonts w:ascii="Times New Roman" w:hAnsi="Times New Roman" w:eastAsia="Times New Roman"/>
+          <w:b/>
+          <w:i/>
+        </w:rPr>
+        <w:t>GPA: 3.96/4</w:t>
+      </w:r>
+      <w:r>
+        <w:rPr>
+          <w:rFonts w:ascii="Times New Roman" w:hAnsi="Times New Roman" w:eastAsia="Times New Roman"/>
+          <w:b w:val="0"/>
+          <w:i/>
+        </w:rPr>
+        <w:t xml:space="preserve"> | </w:t>
+      </w:r>
+      <w:r>
+        <w:rPr>
+          <w:rFonts w:ascii="Times New Roman" w:hAnsi="Times New Roman" w:eastAsia="Times New Roman"/>
+          <w:b/>
+          <w:i/>
+        </w:rPr>
+        <w:t>First Class Honours</w:t>
       </w:r>
     </w:p>
     <w:p>

</xml_diff>

<commit_message>
LangGraph, SQL and Gemini on the résumé and the site.
Co-authored-by: linn-dev-gmi <linn@globalmagicko.com>
</commit_message>
<xml_diff>
--- a/content/about/resume.docx
+++ b/content/about/resume.docx
@@ -442,7 +442,7 @@
           <w:b w:val="0"/>
           <w:i w:val="0"/>
         </w:rPr>
-        <w:t>Built FastAPI services using RAG, MCP servers and AI-driven UI widgets.</w:t>
+        <w:t>Built FastAPI services using LangGraph agents, RAG, MCP servers and AI-driven UI widgets.</w:t>
       </w:r>
     </w:p>
     <w:p>
@@ -775,7 +775,7 @@
           <w:b w:val="0"/>
           <w:i w:val="0"/>
         </w:rPr>
-        <w:t>LLM APIs, agent runtimes &amp; native tool calling, RAG, MCP, LangChain, OCR, Computer Vision (OpenCV, MediaPipe)</w:t>
+        <w:t>LLM APIs, agent runtimes &amp; native tool calling, LangGraph, LangChain, RAG, MCP, Gemini, OCR, Computer Vision (OpenCV, MediaPipe)</w:t>
       </w:r>
     </w:p>
     <w:p>
@@ -796,7 +796,7 @@
           <w:b w:val="0"/>
           <w:i w:val="0"/>
         </w:rPr>
-        <w:t>gRPC/Protobuf, RESTful design, async programming, PostgreSQL, MySQL, MongoDB, Redis</w:t>
+        <w:t>gRPC/Protobuf, RESTful design, async programming, SQL (PostgreSQL, MySQL), MongoDB, Redis</w:t>
       </w:r>
     </w:p>
     <w:p>

</xml_diff>

<commit_message>
Site résumé: GMI is remote for Indonesia, and Cortex is the AI inference service.
Co-authored-by: linn-dev-gmi <linn@globalmagicko.com>
</commit_message>
<xml_diff>
--- a/content/about/resume.docx
+++ b/content/about/resume.docx
@@ -235,7 +235,7 @@
           <w:b w:val="0"/>
           <w:i/>
         </w:rPr>
-        <w:t xml:space="preserve"> | Bangkok, Thailand | Full-time | Apr 2026 - Present</w:t>
+        <w:t xml:space="preserve"> | Indonesia (Remote) | Full-time | Apr 2026 - Present</w:t>
       </w:r>
     </w:p>
     <w:p>
@@ -257,7 +257,7 @@
           <w:b w:val="0"/>
           <w:i w:val="0"/>
         </w:rPr>
-        <w:t xml:space="preserve"> since joining on the reasoning, memory and supervisor services. Contributor to Mindroid, the open-source Rust agent runtime.</w:t>
+        <w:t xml:space="preserve"> since joining on the AI inference, AI memory and agent supervisor services. Contributor to Mindroid, the open-source Rust agent runtime.</w:t>
       </w:r>
     </w:p>
     <w:p>
@@ -301,7 +301,7 @@
           <w:b w:val="0"/>
           <w:i w:val="0"/>
         </w:rPr>
-        <w:t xml:space="preserve">Refactored the reasoning service, cutting fast-path latency </w:t>
+        <w:t xml:space="preserve">Refactored the AI inference service, cutting fast-path latency </w:t>
       </w:r>
       <w:r>
         <w:rPr>
@@ -347,7 +347,7 @@
           <w:b w:val="0"/>
           <w:i w:val="0"/>
         </w:rPr>
-        <w:t>Shipped native tool calling and mid-turn escalation from a fast model to a frontier model across the gateway, reasoning service and supervisor, plus an OpenAI-compatible chat-completions route with tool and image support.</w:t>
+        <w:t>Shipped native tool calling and mid-turn escalation from a fast model to a frontier model across the gateway, AI inference service and supervisor, plus an OpenAI-compatible chat-completions route with tool and image support.</w:t>
       </w:r>
     </w:p>
     <w:p>

</xml_diff>